<commit_message>
fix(templates): the periodic test says question 13 has several correct answers
Question 13's key is "AC"; on the test and on the key page the question now ends "…cu privire la modul de utilizare? (mai multe variante corecte)".

Claude-Session: https://claude.ai/code/session_01A9qjCHVH6kcDAEKFiJoShR
</commit_message>
<xml_diff>
--- a/packages/document-engine/templates/5.2_test_periodic.docx
+++ b/packages/document-engine/templates/5.2_test_periodic.docx
@@ -1959,7 +1959,7 @@
           <w:szCs w:val="20"/>
           <w:lang w:val="ro-RO"/>
         </w:rPr>
-        <w:t>13. Ce veți face când primiți o sarcină de muncă care constă în utilizarea unui mijloc de producție (echipament de muncă) nou pentru dumneavoastră față de care nu cunoașteți amănunte cu privire la modul de utilizare?</w:t>
+        <w:t xml:space="preserve">13. Ce veți face când primiți o sarcină de muncă care constă în utilizarea unui mijloc de producție (echipament de muncă) nou pentru dumneavoastră față de care nu cunoașteți amănunte cu privire la modul de utilizare? (mai multe variante corecte)</w:t>
       </w:r>
     </w:p>
     <w:p>
@@ -6228,7 +6228,7 @@
           <w:szCs w:val="20"/>
           <w:lang w:val="ro-RO"/>
         </w:rPr>
-        <w:t>13. Ce veți face când primiți o sarcină de muncă care constă în utilizarea unui mijloc de producție (echipament de muncă) nou pentru dumneavoastră față de care nu cunoașteți amănunte cu privire la modul de utilizare?</w:t>
+        <w:t xml:space="preserve">13. Ce veți face când primiți o sarcină de muncă care constă în utilizarea unui mijloc de producție (echipament de muncă) nou pentru dumneavoastră față de care nu cunoașteți amănunte cu privire la modul de utilizare? (mai multe variante corecte)</w:t>
       </w:r>
     </w:p>
     <w:p>

</xml_diff>

<commit_message>
fix(templates): the periodic test's question 14 says several answers are right
Claude-Session: https://claude.ai/code/session_01A9qjCHVH6kcDAEKFiJoShR
</commit_message>
<xml_diff>
--- a/packages/document-engine/templates/5.2_test_periodic.docx
+++ b/packages/document-engine/templates/5.2_test_periodic.docx
@@ -2129,7 +2129,7 @@
           <w:szCs w:val="20"/>
           <w:lang w:val="ro-RO"/>
         </w:rPr>
-        <w:t>14. Transportul de către o singură persoană se poate face în cazuri simple, fără leziuni importante (în special fără fracturi) și se realizează prin mai multe tehnici. Care sunt acestea?</w:t>
+        <w:t>14. Transportul de către o singură persoană se poate face în cazuri simple, fără leziuni importante (în special fără fracturi) și se realizează prin mai multe tehnici. Care sunt acestea? (mai multe variante corecte)</w:t>
       </w:r>
     </w:p>
     <w:p>
@@ -6398,7 +6398,7 @@
           <w:szCs w:val="20"/>
           <w:lang w:val="ro-RO"/>
         </w:rPr>
-        <w:t>14. Transportul de către o singură persoană se poate face în cazuri simple, fără leziuni importante (în special fără fracturi) și se realizează prin mai multe tehnici. Care sunt acestea?</w:t>
+        <w:t>14. Transportul de către o singură persoană se poate face în cazuri simple, fără leziuni importante (în special fără fracturi) și se realizează prin mai multe tehnici. Care sunt acestea? (mai multe variante corecte)</w:t>
       </w:r>
     </w:p>
     <w:p>

</xml_diff>

<commit_message>
fix(templates): the periodic test's questions 6 and 13 take their commas
Q6 reads "…a lipsit peste 30 de zile lucrătoare, se face instruirea
suplimentară?" and Q13 c) "…și, în cazul în care nu primesc nicio informație,
solicit…", in the test and in the answer key.

Claude-Session: https://claude.ai/code/session_01A9qjCHVH6kcDAEKFiJoShR
</commit_message>
<xml_diff>
--- a/packages/document-engine/templates/5.2_test_periodic.docx
+++ b/packages/document-engine/templates/5.2_test_periodic.docx
@@ -874,7 +874,7 @@
           <w:szCs w:val="20"/>
           <w:lang w:val="ro-RO"/>
         </w:rPr>
-        <w:t>6. Când un lucrător a lipsit peste 30 de zile lucrătoare se face instruirea suplimentară?</w:t>
+        <w:t xml:space="preserve">6. Când un lucrător a lipsit peste 30 de zile lucrătoare, se face instruirea suplimentară?</w:t>
       </w:r>
     </w:p>
     <w:p>
@@ -2096,7 +2096,7 @@
           <w:szCs w:val="20"/>
           <w:lang w:val="ro-RO"/>
         </w:rPr>
-        <w:t>Refuz să utilizez echipamentul până primesc toate informațiile de care am nevoie cu privire la modul de utilizare al acestuia și în cazul în care nu primesc nicio informație solicit să mi se ofere toate informațiile de care am nevoie și pe care nu le cunosc.</w:t>
+        <w:t xml:space="preserve">Refuz să utilizez echipamentul până primesc toate informațiile de care am nevoie cu privire la modul de utilizare al acestuia și, în cazul în care nu primesc nicio informație, solicit să mi se ofere toate informațiile de care am nevoie și pe care nu le cunosc.</w:t>
       </w:r>
     </w:p>
     <w:p>
@@ -5143,7 +5143,7 @@
           <w:szCs w:val="20"/>
           <w:lang w:val="ro-RO"/>
         </w:rPr>
-        <w:t>6. Când un lucrător a lipsit peste 30 de zile lucrătoare se face instruirea suplimentară?</w:t>
+        <w:t xml:space="preserve">6. Când un lucrător a lipsit peste 30 de zile lucrătoare, se face instruirea suplimentară?</w:t>
       </w:r>
     </w:p>
     <w:p>
@@ -6365,7 +6365,7 @@
           <w:szCs w:val="20"/>
           <w:lang w:val="ro-RO"/>
         </w:rPr>
-        <w:t>Refuz să utilizez echipamentul până primesc toate informațiile de care am nevoie cu privire la modul de utilizare al acestuia și în cazul în care nu primesc nicio informație solicit să mi se ofere toate informațiile de care am nevoie și pe care nu le cunosc.</w:t>
+        <w:t xml:space="preserve">Refuz să utilizez echipamentul până primesc toate informațiile de care am nevoie cu privire la modul de utilizare al acestuia și, în cazul în care nu primesc nicio informație, solicit să mi se ofere toate informațiile de care am nevoie și pe care nu le cunosc.</w:t>
       </w:r>
     </w:p>
     <w:p>

</xml_diff>

<commit_message>
feat(templates): the fire-safety tests and the occupational safety periodic test say under the title of the test and of its specimen "La fiecare întrebare pot fi corecte unul sau mai multe răspunsuri.", since their keys mark several letters for some questions (hiring 8, 9, 11; annual 2, 7; periodic 13, 14); the hiring test of the occupational safety set has one right answer per question and is left as it is; a spec may set `subtitleBelow`, which the fire-safety tests set to 0 so their pages break where they did (#418)
</commit_message>
<xml_diff>
--- a/packages/document-engine/templates/5.2_test_periodic.docx
+++ b/packages/document-engine/templates/5.2_test_periodic.docx
@@ -5,7 +5,7 @@
     <w:p>
       <w:pPr>
         <w:pStyle w:val="Normal"/>
-        <w:keepNext w:val="false"/>
+        <w:keepNext w:val="true"/>
         <w:widowControl/>
         <w:spacing w:before="0" w:after="0"/>
         <w:ind w:hanging="0"/>
@@ -32,6 +32,37 @@
           <w:lang w:val="ro-RO"/>
         </w:rPr>
         <w:t>TESTARE DE VERIFICARE A CUNOȘTINȚELOR PRIVIND SECURITATEA ȘI SĂNĂTATEA ÎN MUNCĂ (PERIODIC)</w:t>
+      </w:r>
+    </w:p>
+    <w:p>
+      <w:pPr>
+        <w:pStyle w:val="Normal"/>
+        <w:keepNext w:val="true"/>
+        <w:widowControl/>
+        <w:spacing w:before="0" w:after="0"/>
+        <w:ind w:hanging="0"/>
+        <w:jc w:val="center"/>
+        <w:rPr>
+          <w:rFonts w:ascii="Arial" w:hAnsi="Arial" w:eastAsia="Arial" w:cs="Arial"/>
+          <w:b w:val="false"/>
+          <w:i/>
+          <w:color w:val="auto"/>
+          <w:sz w:val="20"/>
+          <w:szCs w:val="20"/>
+          <w:lang w:val="ro-RO"/>
+        </w:rPr>
+      </w:pPr>
+      <w:r>
+        <w:rPr>
+          <w:rFonts w:ascii="Arial" w:hAnsi="Arial" w:eastAsia="Arial" w:cs="Arial"/>
+          <w:b w:val="false"/>
+          <w:i/>
+          <w:color w:val="auto"/>
+          <w:sz w:val="20"/>
+          <w:szCs w:val="20"/>
+          <w:lang w:val="ro-RO"/>
+        </w:rPr>
+        <w:t>La fiecare întrebare pot fi corecte unul sau mai multe răspunsuri.</w:t>
       </w:r>
     </w:p>
     <w:p>
@@ -4271,7 +4302,7 @@
     <w:p>
       <w:pPr>
         <w:pStyle w:val="Normal"/>
-        <w:keepNext w:val="false"/>
+        <w:keepNext w:val="true"/>
         <w:widowControl/>
         <w:spacing w:before="120" w:after="0"/>
         <w:ind w:hanging="0"/>
@@ -4301,6 +4332,37 @@
           <w:lang w:val="ro-RO"/>
         </w:rPr>
         <w:t>TESTARE DE VERIFICARE A CUNOȘTINȚELOR PRIVIND SECURITATEA ȘI SĂNĂTATEA ÎN MUNCĂ (PERIODIC)</w:t>
+      </w:r>
+    </w:p>
+    <w:p>
+      <w:pPr>
+        <w:pStyle w:val="Normal"/>
+        <w:keepNext w:val="true"/>
+        <w:widowControl/>
+        <w:spacing w:before="0" w:after="0"/>
+        <w:ind w:hanging="0"/>
+        <w:jc w:val="center"/>
+        <w:rPr>
+          <w:rFonts w:ascii="Arial" w:hAnsi="Arial" w:eastAsia="Arial" w:cs="Arial"/>
+          <w:b w:val="false"/>
+          <w:i/>
+          <w:color w:val="auto"/>
+          <w:sz w:val="20"/>
+          <w:szCs w:val="20"/>
+          <w:lang w:val="ro-RO"/>
+        </w:rPr>
+      </w:pPr>
+      <w:r>
+        <w:rPr>
+          <w:rFonts w:ascii="Arial" w:hAnsi="Arial" w:eastAsia="Arial" w:cs="Arial"/>
+          <w:b w:val="false"/>
+          <w:i/>
+          <w:color w:val="auto"/>
+          <w:sz w:val="20"/>
+          <w:szCs w:val="20"/>
+          <w:lang w:val="ro-RO"/>
+        </w:rPr>
+        <w:t>La fiecare întrebare pot fi corecte unul sau mai multe răspunsuri.</w:t>
       </w:r>
     </w:p>
     <w:p>

</xml_diff>